<commit_message>
Add project docs and update README
Add HomeBudget use-case and requirements documents and expand README with a detailed project overview, functional (FR1–FR10) and non-functional (NF1–NF5) requirements. Update SE410 requirements table (DOCX/PDF) and add new files (.DS_Store and a temporary Word lock file). These changes provide clearer requirements and use-case material for the HomeBudget project.
</commit_message>
<xml_diff>
--- a/SE410-Requirements-Table.docx
+++ b/SE410-Requirements-Table.docx
@@ -2107,7 +2107,7 @@
                 <w:sz w:val="20"/>
                 <w:szCs w:val="20"/>
               </w:rPr>
-              <w:t>The desktop application must be built using Windows Forms or MAUI. It must provide clear screens for logging expenses, managing budgets, and viewing summaries. All forms should be clean, labelled properly, and easy to use without extra instructions.</w:t>
+              <w:t>The desktop application must be built using MAUI. It must provide clear screens for logging expenses, managing budgets, and viewing summaries. All forms should be clean, labelled properly, and easy to use without extra instructions.</w:t>
             </w:r>
           </w:p>
         </w:tc>
@@ -2238,7 +2238,7 @@
                 <w:sz w:val="20"/>
                 <w:szCs w:val="20"/>
               </w:rPr>
-              <w:t>The web application must separate data models, page views, and business logic into distinct layers. Models hold the data, controllers process requests and talk to the database, and views display results to the user. This makes the code easier to maintain and extend.</w:t>
+              <w:t>The web application must separate data models, page views, and business logic into distinct layers. Models hold the data, controllers process requests and talk to the database, and views display results to the user.</w:t>
             </w:r>
           </w:p>
         </w:tc>

</xml_diff>